<commit_message>
LA MARQUE 4부 14화 La réconciliation (+13화 연도 수정)
Co-Authored-By: Claude Opus 5.5 <noreply@anthropic.com>
Claude-Session: https://claude.ai/code/session_01N4vhCLeYxrjvGnDxQBD9Cq
</commit_message>
<xml_diff>
--- a/la-marque/대본/4부/13화_Un_second_fournisseur.docx
+++ b/la-marque/대본/4부/13화_Un_second_fournisseur.docx
@@ -580,7 +580,7 @@
           <w:bCs/>
           <w:b/>
         </w:rPr>
-        <w:t xml:space="preserve">레시피는 30년의 일</w:t>
+        <w:t xml:space="preserve">레시피는 20년의 일</w:t>
       </w:r>
       <w:r>
         <w:rPr>
@@ -1594,7 +1594,7 @@
         <w:pStyle w:val="BodyText"/>
       </w:pPr>
       <w:r>
-        <w:t xml:space="preserve">JIHOON: Le président ne va pas aimer. Sa recette, c’est trente ans de travail.</w:t>
+        <w:t xml:space="preserve">JIHOON: Le président ne va pas aimer. Sa recette, c’est vingt ans de travail.</w:t>
       </w:r>
     </w:p>
     <w:p>
@@ -4539,7 +4539,7 @@
         <w:pStyle w:val="BodyText"/>
       </w:pPr>
       <w:r>
-        <w:t xml:space="preserve">지훈: 대표님이 좋아하지 않으실 거예요. 그 레시피는 30년의 일이에요.</w:t>
+        <w:t xml:space="preserve">지훈: 대표님이 좋아하지 않으실 거예요. 그 레시피는 20년의 일이에요.</w:t>
       </w:r>
     </w:p>
     <w:p>

</xml_diff>